<commit_message>
fix SAR Report structuring
</commit_message>
<xml_diff>
--- a/sample_SAR_preview.docx
+++ b/sample_SAR_preview.docx
@@ -3,6 +3,43 @@
 <w:document xmlns:wpc="http://schemas.microsoft.com/office/word/2010/wordprocessingCanvas" xmlns:mo="http://schemas.microsoft.com/office/mac/office/2008/main" xmlns:mc="http://schemas.openxmlformats.org/markup-compatibility/2006" xmlns:mv="urn:schemas-microsoft-com:mac:vml" xmlns:o="urn:schemas-microsoft-com:office:office" xmlns:r="http://schemas.openxmlformats.org/officeDocument/2006/relationships" xmlns:m="http://schemas.openxmlformats.org/officeDocument/2006/math" xmlns:v="urn:schemas-microsoft-com:vml" xmlns:wp14="http://schemas.microsoft.com/office/word/2010/wordprocessingDrawing" xmlns:wp="http://schemas.openxmlformats.org/drawingml/2006/wordprocessingDrawing" xmlns:w10="urn:schemas-microsoft-com:office:word" xmlns:w="http://schemas.openxmlformats.org/wordprocessingml/2006/main" xmlns:w14="http://schemas.microsoft.com/office/word/2010/wordml" xmlns:wpg="http://schemas.microsoft.com/office/word/2010/wordprocessingGroup" xmlns:wpi="http://schemas.microsoft.com/office/word/2010/wordprocessingInk" xmlns:wne="http://schemas.microsoft.com/office/word/2006/wordml" xmlns:wps="http://schemas.microsoft.com/office/word/2010/wordprocessingShape" mc:Ignorable="w14 wp14">
   <w:body>
     <w:p>
+      <w:r>
+        <w:drawing>
+          <wp:inline xmlns:a="http://schemas.openxmlformats.org/drawingml/2006/main" xmlns:pic="http://schemas.openxmlformats.org/drawingml/2006/picture">
+            <wp:extent cx="384048" cy="384048"/>
+            <wp:docPr id="1" name="Picture 1"/>
+            <wp:cNvGraphicFramePr>
+              <a:graphicFrameLocks noChangeAspect="1"/>
+            </wp:cNvGraphicFramePr>
+            <a:graphic>
+              <a:graphicData uri="http://schemas.openxmlformats.org/drawingml/2006/picture">
+                <pic:pic>
+                  <pic:nvPicPr>
+                    <pic:cNvPr id="0" name="ComplianceGuardLogo.png"/>
+                    <pic:cNvPicPr/>
+                  </pic:nvPicPr>
+                  <pic:blipFill>
+                    <a:blip r:embed="rId9"/>
+                    <a:stretch>
+                      <a:fillRect/>
+                    </a:stretch>
+                  </pic:blipFill>
+                  <pic:spPr>
+                    <a:xfrm>
+                      <a:off x="0" y="0"/>
+                      <a:ext cx="384048" cy="384048"/>
+                    </a:xfrm>
+                    <a:prstGeom prst="rect"/>
+                  </pic:spPr>
+                </pic:pic>
+              </a:graphicData>
+            </a:graphic>
+          </wp:inline>
+        </w:drawing>
+      </w:r>
+      <w:r>
+        <w:t xml:space="preserve">   </w:t>
+      </w:r>
       <w:r>
         <w:rPr>
           <w:b/>
@@ -45,7 +82,7 @@
           <w:color w:val="6B7280"/>
           <w:sz w:val="21"/>
         </w:rPr>
-        <w:t>Draft investigation package - requires human analyst review before STR lodgement with FIED.</w:t>
+        <w:t>Generated by ComplianceGuard AI - pending analyst sign-off</w:t>
       </w:r>
     </w:p>
     <w:tbl>
@@ -84,7 +121,7 @@
                 <w:color w:val="1F2937"/>
                 <w:sz w:val="19"/>
               </w:rPr>
-              <w:t>AML-2026-001</w:t>
+              <w:t>AML-20260628-001</w:t>
             </w:r>
           </w:p>
         </w:tc>
@@ -115,7 +152,7 @@
                 <w:color w:val="1F2937"/>
                 <w:sz w:val="19"/>
               </w:rPr>
-              <w:t>CUST-10291</w:t>
+              <w:t>Sonny Sanputra</w:t>
             </w:r>
           </w:p>
         </w:tc>
@@ -163,37 +200,6 @@
                 <w:color w:val="6B7280"/>
                 <w:sz w:val="18"/>
               </w:rPr>
-              <w:t>Date generated</w:t>
-            </w:r>
-          </w:p>
-        </w:tc>
-        <w:tc>
-          <w:tcPr>
-            <w:tcW w:type="dxa" w:w="4320"/>
-          </w:tcPr>
-          <w:p>
-            <w:r>
-              <w:rPr>
-                <w:color w:val="1F2937"/>
-                <w:sz w:val="19"/>
-              </w:rPr>
-              <w:t>2026-06-26 15:35</w:t>
-            </w:r>
-          </w:p>
-        </w:tc>
-      </w:tr>
-      <w:tr>
-        <w:tc>
-          <w:tcPr>
-            <w:tcW w:type="dxa" w:w="4320"/>
-          </w:tcPr>
-          <w:p>
-            <w:r>
-              <w:rPr>
-                <w:b/>
-                <w:color w:val="6B7280"/>
-                <w:sz w:val="18"/>
-              </w:rPr>
               <w:t>Status</w:t>
             </w:r>
           </w:p>
@@ -208,38 +214,7 @@
                 <w:color w:val="1F2937"/>
                 <w:sz w:val="19"/>
               </w:rPr>
-              <w:t>Awaiting Analyst Review</w:t>
-            </w:r>
-          </w:p>
-        </w:tc>
-      </w:tr>
-      <w:tr>
-        <w:tc>
-          <w:tcPr>
-            <w:tcW w:type="dxa" w:w="4320"/>
-          </w:tcPr>
-          <w:p>
-            <w:r>
-              <w:rPr>
-                <w:b/>
-                <w:color w:val="6B7280"/>
-                <w:sz w:val="18"/>
-              </w:rPr>
-              <w:t>Priority</w:t>
-            </w:r>
-          </w:p>
-        </w:tc>
-        <w:tc>
-          <w:tcPr>
-            <w:tcW w:type="dxa" w:w="4320"/>
-          </w:tcPr>
-          <w:p>
-            <w:r>
-              <w:rPr>
-                <w:color w:val="1F2937"/>
-                <w:sz w:val="19"/>
-              </w:rPr>
-              <w:t>P1  (Critical - immediate review)</w:t>
+              <w:t>Awaiting analyst review</w:t>
             </w:r>
           </w:p>
         </w:tc>
@@ -270,7 +245,7 @@
                 <w:color w:val="1F2937"/>
                 <w:sz w:val="19"/>
               </w:rPr>
-              <w:t>82/100  -  HIGH</w:t>
+              <w:t>HIGH (82/100)</w:t>
             </w:r>
           </w:p>
         </w:tc>
@@ -301,7 +276,7 @@
                 <w:color w:val="1F2937"/>
                 <w:sz w:val="19"/>
               </w:rPr>
-              <w:t>CompliGuard AI - multi-agent investigation</w:t>
+              <w:t>ComplianceGuard AI</w:t>
             </w:r>
           </w:p>
         </w:tc>
@@ -316,7 +291,7 @@
         <w:rPr>
           <w:color w:val="F97316"/>
         </w:rPr>
-        <w:t>Case Overview</w:t>
+        <w:t>1. Subject</w:t>
       </w:r>
     </w:p>
     <w:p>
@@ -325,9 +300,18 @@
       </w:pPr>
       <w:r>
         <w:rPr>
+          <w:b/>
+          <w:color w:val="1F2937"/>
           <w:sz w:val="19"/>
         </w:rPr>
-        <w:t>Case ID: AML-2026-001</w:t>
+        <w:t xml:space="preserve">Name: </w:t>
+      </w:r>
+      <w:r>
+        <w:rPr>
+          <w:color w:val="1F2937"/>
+          <w:sz w:val="19"/>
+        </w:rPr>
+        <w:t>Sonny Sanputra</w:t>
       </w:r>
     </w:p>
     <w:p>
@@ -336,9 +320,18 @@
       </w:pPr>
       <w:r>
         <w:rPr>
+          <w:b/>
+          <w:color w:val="1F2937"/>
           <w:sz w:val="19"/>
         </w:rPr>
-        <w:t>Customer ID: CUST-10291</w:t>
+        <w:t xml:space="preserve">Customer ID: </w:t>
+      </w:r>
+      <w:r>
+        <w:rPr>
+          <w:color w:val="1F2937"/>
+          <w:sz w:val="19"/>
+        </w:rPr>
+        <w:t>CUST-TEST-01</w:t>
       </w:r>
     </w:p>
     <w:p>
@@ -347,9 +340,18 @@
       </w:pPr>
       <w:r>
         <w:rPr>
+          <w:b/>
+          <w:color w:val="1F2937"/>
           <w:sz w:val="19"/>
         </w:rPr>
-        <w:t>Status: AWAITING_ANALYST_REVIEW</w:t>
+        <w:t xml:space="preserve">Occupation: </w:t>
+      </w:r>
+      <w:r>
+        <w:rPr>
+          <w:color w:val="1F2937"/>
+          <w:sz w:val="19"/>
+        </w:rPr>
+        <w:t>Junior Clerk with a declared monthly income of RM4,000, which is materially inconsistent with the transfer volume observed during the review period.</w:t>
       </w:r>
     </w:p>
     <w:p>
@@ -358,9 +360,18 @@
       </w:pPr>
       <w:r>
         <w:rPr>
+          <w:b/>
+          <w:color w:val="1F2937"/>
           <w:sz w:val="19"/>
         </w:rPr>
-        <w:t>Alert type: Structuring  |  Priority: P1</w:t>
+        <w:t xml:space="preserve">Account age: </w:t>
+      </w:r>
+      <w:r>
+        <w:rPr>
+          <w:color w:val="1F2937"/>
+          <w:sz w:val="19"/>
+        </w:rPr>
+        <w:t>14 months</w:t>
       </w:r>
     </w:p>
     <w:p>
@@ -371,7 +382,7 @@
         <w:rPr>
           <w:color w:val="F97316"/>
         </w:rPr>
-        <w:t>Risk Assessment</w:t>
+        <w:t>2. Suspicious Activity</w:t>
       </w:r>
     </w:p>
     <w:p>
@@ -380,9 +391,18 @@
       </w:pPr>
       <w:r>
         <w:rPr>
+          <w:b/>
+          <w:color w:val="1F2937"/>
           <w:sz w:val="19"/>
         </w:rPr>
-        <w:t>Final score: 82/100 (HIGH)</w:t>
+        <w:t xml:space="preserve">Typology: </w:t>
+      </w:r>
+      <w:r>
+        <w:rPr>
+          <w:color w:val="1F2937"/>
+          <w:sz w:val="19"/>
+        </w:rPr>
+        <w:t>Structuring (smurfing)</w:t>
       </w:r>
     </w:p>
     <w:p>
@@ -391,218 +411,10 @@
       </w:pPr>
       <w:r>
         <w:rPr>
+          <w:color w:val="1F2937"/>
           <w:sz w:val="19"/>
         </w:rPr>
-        <w:t>Rule baseline: 85  |  AI assessment: 80</w:t>
-      </w:r>
-    </w:p>
-    <w:p>
-      <w:pPr>
-        <w:pStyle w:val="ListBullet"/>
-      </w:pPr>
-      <w:r>
-        <w:rPr>
-          <w:sz w:val="19"/>
-        </w:rPr>
-        <w:t>Recommendation: Escalate for STR determination.</w:t>
-      </w:r>
-    </w:p>
-    <w:p>
-      <w:pPr>
-        <w:pStyle w:val="ListBullet"/>
-      </w:pPr>
-      <w:r>
-        <w:rPr>
-          <w:sz w:val="19"/>
-        </w:rPr>
-        <w:t>Explanation: Sub-threshold structuring to a new high-risk overseas recipient.</w:t>
-      </w:r>
-    </w:p>
-    <w:p>
-      <w:pPr>
-        <w:pStyle w:val="Heading1"/>
-      </w:pPr>
-      <w:r>
-        <w:rPr>
-          <w:color w:val="F97316"/>
-        </w:rPr>
-        <w:t>Triggered AML Rules</w:t>
-      </w:r>
-    </w:p>
-    <w:p>
-      <w:pPr>
-        <w:pStyle w:val="ListBullet"/>
-      </w:pPr>
-      <w:r>
-        <w:rPr>
-          <w:sz w:val="19"/>
-        </w:rPr>
-        <w:t>[AML-STRUCT-001] +25 Structuring / Smurfing (HIGH) - 3 transfers between RM9,000 and RM10,000 within 24h. [evidence: EV-TXN-001, EV-TXN-003]</w:t>
-      </w:r>
-    </w:p>
-    <w:p>
-      <w:pPr>
-        <w:pStyle w:val="ListBullet"/>
-      </w:pPr>
-      <w:r>
-        <w:rPr>
-          <w:sz w:val="19"/>
-        </w:rPr>
-        <w:t>[AML-GEO-001] +20 High-Risk Overseas Transfer (MEDIUM_HIGH) - Transfer to Cambodia. [evidence: EV-TXN-002]</w:t>
-      </w:r>
-    </w:p>
-    <w:p>
-      <w:pPr>
-        <w:pStyle w:val="Heading1"/>
-      </w:pPr>
-      <w:r>
-        <w:rPr>
-          <w:color w:val="F97316"/>
-        </w:rPr>
-        <w:t>Agent Findings</w:t>
-      </w:r>
-    </w:p>
-    <w:p>
-      <w:pPr>
-        <w:pStyle w:val="ListBullet"/>
-      </w:pPr>
-      <w:r>
-        <w:rPr>
-          <w:sz w:val="19"/>
-        </w:rPr>
-        <w:t>Typology: structuring</w:t>
-      </w:r>
-    </w:p>
-    <w:p>
-      <w:pPr>
-        <w:pStyle w:val="ListBullet"/>
-      </w:pPr>
-      <w:r>
-        <w:rPr>
-          <w:sz w:val="19"/>
-        </w:rPr>
-        <w:t>KYC: inconsistent | checks failed: ['income_mismatch'] | EDD: True</w:t>
-      </w:r>
-    </w:p>
-    <w:p>
-      <w:pPr>
-        <w:pStyle w:val="ListBullet"/>
-      </w:pPr>
-      <w:r>
-        <w:rPr>
-          <w:sz w:val="19"/>
-        </w:rPr>
-        <w:t>Watchlist: Possible match (best 88% on INTERNAL_BLACKLIST)</w:t>
-      </w:r>
-    </w:p>
-    <w:p>
-      <w:pPr>
-        <w:pStyle w:val="ListBullet"/>
-      </w:pPr>
-      <w:r>
-        <w:rPr>
-          <w:sz w:val="19"/>
-        </w:rPr>
-        <w:t>Memory: No prior history</w:t>
-      </w:r>
-    </w:p>
-    <w:p>
-      <w:pPr>
-        <w:pStyle w:val="Heading1"/>
-      </w:pPr>
-      <w:r>
-        <w:rPr>
-          <w:color w:val="F97316"/>
-        </w:rPr>
-        <w:t>Policy References</w:t>
-      </w:r>
-    </w:p>
-    <w:p>
-      <w:pPr>
-        <w:pStyle w:val="ListBullet"/>
-      </w:pPr>
-      <w:r>
-        <w:rPr>
-          <w:sz w:val="19"/>
-        </w:rPr>
-        <w:t>MY-AML-STR-001: Malaysia Suspicious Transaction Review Policy (section 3)</w:t>
-      </w:r>
-    </w:p>
-    <w:p>
-      <w:pPr>
-        <w:pStyle w:val="Heading1"/>
-      </w:pPr>
-      <w:r>
-        <w:rPr>
-          <w:color w:val="F97316"/>
-        </w:rPr>
-        <w:t>SAR Draft</w:t>
-      </w:r>
-    </w:p>
-    <w:p>
-      <w:pPr>
-        <w:pStyle w:val="ListBullet"/>
-      </w:pPr>
-      <w:r>
-        <w:rPr>
-          <w:sz w:val="19"/>
-        </w:rPr>
-        <w:t>1. Customer Information ...</w:t>
-      </w:r>
-    </w:p>
-    <w:p>
-      <w:pPr>
-        <w:pStyle w:val="Heading1"/>
-      </w:pPr>
-      <w:r>
-        <w:rPr>
-          <w:color w:val="F97316"/>
-        </w:rPr>
-        <w:t>Evidence Register</w:t>
-      </w:r>
-    </w:p>
-    <w:p>
-      <w:pPr>
-        <w:pStyle w:val="ListBullet"/>
-      </w:pPr>
-      <w:r>
-        <w:rPr>
-          <w:sz w:val="19"/>
-        </w:rPr>
-        <w:t>[EV-TXN-001] transaction/TXN-8801.amount = 9800 - RM9,800 to Global Trade Ltd (Cambodia)</w:t>
-      </w:r>
-    </w:p>
-    <w:p>
-      <w:pPr>
-        <w:pStyle w:val="Heading1"/>
-      </w:pPr>
-      <w:r>
-        <w:rPr>
-          <w:color w:val="F97316"/>
-        </w:rPr>
-        <w:t>Audit Timeline</w:t>
-      </w:r>
-    </w:p>
-    <w:p>
-      <w:pPr>
-        <w:pStyle w:val="ListBullet"/>
-      </w:pPr>
-      <w:r>
-        <w:rPr>
-          <w:sz w:val="19"/>
-        </w:rPr>
-        <w:t>10:00:01 - Alert Intake Agent triaged</w:t>
-      </w:r>
-    </w:p>
-    <w:p>
-      <w:pPr>
-        <w:pStyle w:val="ListBullet"/>
-      </w:pPr>
-      <w:r>
-        <w:rPr>
-          <w:sz w:val="19"/>
-        </w:rPr>
-        <w:t>10:00:05 - Risk Scoring Agent scored 82/100</w:t>
+        <w:t>The customer executed three transfers of RM9,800 each to Global Trade Ltd within a single day, each deliberately just below the RM10,000 cash transaction reporting threshold.</w:t>
       </w:r>
     </w:p>
     <w:p/>
@@ -617,7 +429,7 @@
       </w:r>
     </w:p>
     <w:sectPr>
-      <w:footerReference w:type="default" r:id="rId9"/>
+      <w:footerReference w:type="default" r:id="rId10"/>
       <w:pgSz w:w="12240" w:h="15840"/>
       <w:pgMar w:top="1440" w:right="1800" w:bottom="1440" w:left="1800" w:header="720" w:footer="720" w:gutter="0"/>
       <w:cols w:space="720"/>

</xml_diff>